<commit_message>
v2.6.1: normalize naryPr to reference structure (ctrlPr, no subHide/supHide)
MML2OMML.XSL emits subHide/supHide="off" in naryPr; some viewers render
summation limits as side scripts for that structure. fix_sum_limits now
strips subHide/supHide and appends ctrlPr(Cambria Math), matching the
reference document that renders above/below correctly. Regenerated
examples, updated omml.md, added CHANGELOG entry.

Co-Authored-By: Claude <noreply@anthropic.com>
</commit_message>
<xml_diff>
--- a/examples/exercises.docx
+++ b/examples/exercises.docx
@@ -72,8 +72,11 @@
             <m:chr m:val="∫"/>
             <m:limLoc m:val="subSup"/>
             <m:grow m:val="1"/>
-            <m:subHide m:val="off"/>
-            <m:supHide m:val="off"/>
+            <m:ctrlPr>
+              <w:rPr>
+                <w:rFonts w:ascii="Cambria Math" w:hAnsi="Cambria Math"/>
+              </w:rPr>
+            </m:ctrlPr>
           </m:naryPr>
           <m:sub>
             <m:r>
@@ -156,8 +159,11 @@
             <m:chr m:val="∑"/>
             <m:limLoc m:val="undOvr"/>
             <m:grow m:val="1"/>
-            <m:subHide m:val="off"/>
-            <m:supHide m:val="off"/>
+            <m:ctrlPr>
+              <w:rPr>
+                <w:rFonts w:ascii="Cambria Math" w:hAnsi="Cambria Math"/>
+              </w:rPr>
+            </m:ctrlPr>
           </m:naryPr>
           <m:sub>
             <m:r>

</xml_diff>